<commit_message>
Fix: normalize manuscript font sizes to academic standards
- Normal style: 20pt -> 11pt (comment said 11pt, code had 20pt bug)
- Title: 1pt (hidden) -> 16pt bold (now properly visible)
- Running title: 22pt -> 10pt
- Author names: 21pt -> 14pt
- Affiliations: 22pt -> 10pt
- Correspondence email: 22pt -> 10pt
- Keywords: 22pt -> 10pt
- References: 22pt -> 10pt
- Section headings: 16/14/12 -> 14/12/11
- Body text, figure legends, ORCID: 11pt (unchanged)
- Manuscript DOCX and v34 ZIP rebuilt
</commit_message>
<xml_diff>
--- a/version3/CKI_NAR_Submission_v34/CKI_NAR_Manuscript.docx
+++ b/version3/CKI_NAR_Submission_v34/CKI_NAR_Manuscript.docx
@@ -10,8 +10,9 @@
       <w:r>
         <w:rPr>
           <w:rFonts w:ascii="Arial" w:hAnsi="Arial"/>
+          <w:b/>
           <w:color w:val="000000"/>
-          <w:sz w:val="2"/>
+          <w:sz w:val="32"/>
         </w:rPr>
         <w:t>CKI: A Cell-state Kinetic Index for Quantifying Baseline-Normalized Transcriptomic Remodeling</w:t>
       </w:r>
@@ -24,7 +25,7 @@
         <w:rPr>
           <w:rFonts w:ascii="Arial" w:hAnsi="Arial"/>
           <w:color w:val="000000"/>
-          <w:sz w:val="44"/>
+          <w:sz w:val="20"/>
         </w:rPr>
         <w:t>Running title: CKI: Baseline-Normalized Divergence Index</w:t>
       </w:r>
@@ -37,7 +38,7 @@
         <w:rPr>
           <w:rFonts w:ascii="Arial" w:hAnsi="Arial"/>
           <w:color w:val="000000"/>
-          <w:sz w:val="42"/>
+          <w:sz w:val="28"/>
         </w:rPr>
         <w:t>Xianming Wu</w:t>
       </w:r>
@@ -57,7 +58,7 @@
         <w:rPr>
           <w:rFonts w:ascii="Arial" w:hAnsi="Arial"/>
           <w:color w:val="000000"/>
-          <w:sz w:val="42"/>
+          <w:sz w:val="28"/>
         </w:rPr>
         <w:t>Li Zhang</w:t>
       </w:r>
@@ -97,7 +98,7 @@
         <w:rPr>
           <w:rFonts w:ascii="Arial" w:hAnsi="Arial"/>
           <w:color w:val="000000"/>
-          <w:sz w:val="44"/>
+          <w:sz w:val="20"/>
           <w:vertAlign w:val="superscript"/>
         </w:rPr>
         <w:t>1</w:t>
@@ -106,7 +107,7 @@
         <w:rPr>
           <w:rFonts w:ascii="Arial" w:hAnsi="Arial"/>
           <w:color w:val="000000"/>
-          <w:sz w:val="44"/>
+          <w:sz w:val="20"/>
         </w:rPr>
         <w:t>Chinese Institute for Brain Research, Beijing, China</w:t>
       </w:r>
@@ -119,7 +120,7 @@
         <w:rPr>
           <w:rFonts w:ascii="Arial" w:hAnsi="Arial"/>
           <w:color w:val="000000"/>
-          <w:sz w:val="44"/>
+          <w:sz w:val="20"/>
           <w:vertAlign w:val="superscript"/>
         </w:rPr>
         <w:t>2</w:t>
@@ -128,7 +129,7 @@
         <w:rPr>
           <w:rFonts w:ascii="Arial" w:hAnsi="Arial"/>
           <w:color w:val="000000"/>
-          <w:sz w:val="44"/>
+          <w:sz w:val="20"/>
         </w:rPr>
         <w:t>Institute of Blood Transfusion, Chinese Academy of Medical Sciences &amp; Peking Union Medical College, Chengdu, China</w:t>
       </w:r>
@@ -141,7 +142,7 @@
         <w:rPr>
           <w:rFonts w:ascii="Arial" w:hAnsi="Arial"/>
           <w:color w:val="000000"/>
-          <w:sz w:val="44"/>
+          <w:sz w:val="20"/>
         </w:rPr>
         <w:t>* To whom correspondence should be addressed. Email: knightz@pumc.edu.cn</w:t>
       </w:r>
@@ -168,7 +169,7 @@
         <w:rPr>
           <w:rFonts w:ascii="Arial" w:hAnsi="Arial"/>
           <w:color w:val="000000"/>
-          <w:sz w:val="32"/>
+          <w:sz w:val="28"/>
           <w:b/>
         </w:rPr>
         <w:t>Graphical Abstract</w:t>
@@ -199,7 +200,7 @@
         <w:rPr>
           <w:rFonts w:ascii="Arial" w:hAnsi="Arial"/>
           <w:color w:val="000000"/>
-          <w:sz w:val="32"/>
+          <w:sz w:val="28"/>
           <w:b/>
         </w:rPr>
         <w:t>Abstract</w:t>
@@ -229,7 +230,7 @@
         <w:rPr>
           <w:rFonts w:ascii="Arial" w:hAnsi="Arial"/>
           <w:color w:val="000000"/>
-          <w:sz w:val="44"/>
+          <w:sz w:val="20"/>
         </w:rPr>
         <w:t>Keywords: cell-state divergence, housekeeping genes, Jensen-Shannon decomposition, transcriptomic remodeling, single-cell genomics</w:t>
       </w:r>
@@ -243,7 +244,7 @@
         <w:rPr>
           <w:rFonts w:ascii="Arial" w:hAnsi="Arial"/>
           <w:color w:val="000000"/>
-          <w:sz w:val="32"/>
+          <w:sz w:val="28"/>
           <w:b/>
         </w:rPr>
         <w:t>Introduction</w:t>
@@ -338,7 +339,7 @@
         <w:rPr>
           <w:rFonts w:ascii="Arial" w:hAnsi="Arial"/>
           <w:color w:val="000000"/>
-          <w:sz w:val="32"/>
+          <w:sz w:val="28"/>
           <w:b/>
         </w:rPr>
         <w:t>Materials and Methods</w:t>
@@ -353,7 +354,7 @@
         <w:rPr>
           <w:rFonts w:ascii="Arial" w:hAnsi="Arial"/>
           <w:color w:val="000000"/>
-          <w:sz w:val="28"/>
+          <w:sz w:val="24"/>
           <w:b/>
         </w:rPr>
         <w:t>CKI computation</w:t>
@@ -400,7 +401,7 @@
         <w:rPr>
           <w:rFonts w:ascii="Arial" w:hAnsi="Arial"/>
           <w:color w:val="000000"/>
-          <w:sz w:val="28"/>
+          <w:sz w:val="24"/>
           <w:b/>
         </w:rPr>
         <w:t>Dimensionality invariance of JS divergence</w:t>
@@ -431,7 +432,7 @@
         <w:rPr>
           <w:rFonts w:ascii="Arial" w:hAnsi="Arial"/>
           <w:color w:val="000000"/>
-          <w:sz w:val="28"/>
+          <w:sz w:val="24"/>
           <w:b/>
         </w:rPr>
         <w:t>Bootstrap permutation test</w:t>
@@ -462,7 +463,7 @@
         <w:rPr>
           <w:rFonts w:ascii="Arial" w:hAnsi="Arial"/>
           <w:color w:val="000000"/>
-          <w:sz w:val="28"/>
+          <w:sz w:val="24"/>
           <w:b/>
         </w:rPr>
         <w:t>Datasets</w:t>
@@ -541,7 +542,7 @@
         <w:rPr>
           <w:rFonts w:ascii="Arial" w:hAnsi="Arial"/>
           <w:color w:val="000000"/>
-          <w:sz w:val="28"/>
+          <w:sz w:val="24"/>
           <w:b/>
         </w:rPr>
         <w:t>Method comparison</w:t>
@@ -572,7 +573,7 @@
         <w:rPr>
           <w:rFonts w:ascii="Arial" w:hAnsi="Arial"/>
           <w:color w:val="000000"/>
-          <w:sz w:val="28"/>
+          <w:sz w:val="24"/>
           <w:b/>
         </w:rPr>
         <w:t>Multiplicative residual model for brain regional analysis</w:t>
@@ -603,7 +604,7 @@
         <w:rPr>
           <w:rFonts w:ascii="Arial" w:hAnsi="Arial"/>
           <w:color w:val="000000"/>
-          <w:sz w:val="28"/>
+          <w:sz w:val="24"/>
           <w:b/>
         </w:rPr>
         <w:t>Clinical severity analysis</w:t>
@@ -634,7 +635,7 @@
         <w:rPr>
           <w:rFonts w:ascii="Arial" w:hAnsi="Arial"/>
           <w:color w:val="000000"/>
-          <w:sz w:val="28"/>
+          <w:sz w:val="24"/>
           <w:b/>
         </w:rPr>
         <w:t>Computational environment</w:t>
@@ -665,7 +666,7 @@
         <w:rPr>
           <w:rFonts w:ascii="Arial" w:hAnsi="Arial"/>
           <w:color w:val="000000"/>
-          <w:sz w:val="28"/>
+          <w:sz w:val="24"/>
           <w:b/>
         </w:rPr>
         <w:t>Statistical reporting</w:t>
@@ -712,7 +713,7 @@
         <w:rPr>
           <w:rFonts w:ascii="Arial" w:hAnsi="Arial"/>
           <w:color w:val="000000"/>
-          <w:sz w:val="32"/>
+          <w:sz w:val="28"/>
           <w:b/>
         </w:rPr>
         <w:t>Results</w:t>
@@ -727,7 +728,7 @@
         <w:rPr>
           <w:rFonts w:ascii="Arial" w:hAnsi="Arial"/>
           <w:color w:val="000000"/>
-          <w:sz w:val="28"/>
+          <w:sz w:val="24"/>
           <w:b/>
         </w:rPr>
         <w:t>Decomposing transcriptomic variation</w:t>
@@ -822,7 +823,7 @@
         <w:rPr>
           <w:rFonts w:ascii="Arial" w:hAnsi="Arial"/>
           <w:color w:val="000000"/>
-          <w:sz w:val="28"/>
+          <w:sz w:val="24"/>
           <w:b/>
         </w:rPr>
         <w:t>Calibration confirms baseline behavior at baseline</w:t>
@@ -901,7 +902,7 @@
         <w:rPr>
           <w:rFonts w:ascii="Arial" w:hAnsi="Arial"/>
           <w:color w:val="000000"/>
-          <w:sz w:val="28"/>
+          <w:sz w:val="24"/>
           <w:b/>
         </w:rPr>
         <w:t>CKI captures information that standard metrics miss</w:t>
@@ -1141,7 +1142,7 @@
         <w:rPr>
           <w:rFonts w:ascii="Arial" w:hAnsi="Arial"/>
           <w:color w:val="000000"/>
-          <w:sz w:val="28"/>
+          <w:sz w:val="24"/>
           <w:b/>
         </w:rPr>
         <w:t>Cancer analysis reveals unexpected transcriptional convergence</w:t>
@@ -1220,7 +1221,7 @@
         <w:rPr>
           <w:rFonts w:ascii="Arial" w:hAnsi="Arial"/>
           <w:color w:val="000000"/>
-          <w:sz w:val="28"/>
+          <w:sz w:val="24"/>
           <w:b/>
         </w:rPr>
         <w:t>CKI ranks cell types by cross-organ conservation</w:t>
@@ -2070,7 +2071,7 @@
         <w:rPr>
           <w:rFonts w:ascii="Arial" w:hAnsi="Arial"/>
           <w:color w:val="000000"/>
-          <w:sz w:val="28"/>
+          <w:sz w:val="24"/>
           <w:b/>
         </w:rPr>
         <w:t>Brain regional analysis reveals cell-type differentiation gradients</w:t>
@@ -2149,7 +2150,7 @@
         <w:rPr>
           <w:rFonts w:ascii="Arial" w:hAnsi="Arial"/>
           <w:color w:val="000000"/>
-          <w:sz w:val="28"/>
+          <w:sz w:val="24"/>
           <w:b/>
         </w:rPr>
         <w:t>CKI correlates with developmental origin signatures across brain regions</w:t>
@@ -2212,7 +2213,7 @@
         <w:rPr>
           <w:rFonts w:ascii="Arial" w:hAnsi="Arial"/>
           <w:color w:val="000000"/>
-          <w:sz w:val="24"/>
+          <w:sz w:val="22"/>
           <w:b/>
         </w:rPr>
         <w:t>OPCs: internal consistency check</w:t>
@@ -2243,7 +2244,7 @@
         <w:rPr>
           <w:rFonts w:ascii="Arial" w:hAnsi="Arial"/>
           <w:color w:val="000000"/>
-          <w:sz w:val="24"/>
+          <w:sz w:val="22"/>
           <w:b/>
         </w:rPr>
         <w:t>Oligodendrocytes: developmental origin rather than migration</w:t>
@@ -2274,7 +2275,7 @@
         <w:rPr>
           <w:rFonts w:ascii="Arial" w:hAnsi="Arial"/>
           <w:color w:val="000000"/>
-          <w:sz w:val="24"/>
+          <w:sz w:val="22"/>
           <w:b/>
         </w:rPr>
         <w:t>Astrocytes: regional specialization with developmental origins</w:t>
@@ -2305,7 +2306,7 @@
         <w:rPr>
           <w:rFonts w:ascii="Arial" w:hAnsi="Arial"/>
           <w:color w:val="000000"/>
-          <w:sz w:val="24"/>
+          <w:sz w:val="22"/>
           <w:b/>
         </w:rPr>
         <w:t>Bergmann glia: cerebellar molecular topography</w:t>
@@ -2336,7 +2337,7 @@
         <w:rPr>
           <w:rFonts w:ascii="Arial" w:hAnsi="Arial"/>
           <w:color w:val="000000"/>
-          <w:sz w:val="24"/>
+          <w:sz w:val="22"/>
           <w:b/>
         </w:rPr>
         <w:t>Threshold-passing but non-significant signals</w:t>
@@ -2367,7 +2368,7 @@
         <w:rPr>
           <w:rFonts w:ascii="Arial" w:hAnsi="Arial"/>
           <w:color w:val="000000"/>
-          <w:sz w:val="32"/>
+          <w:sz w:val="28"/>
           <w:b/>
         </w:rPr>
         <w:t>Discussion</w:t>
@@ -2542,7 +2543,7 @@
         <w:rPr>
           <w:rFonts w:ascii="Arial" w:hAnsi="Arial"/>
           <w:color w:val="000000"/>
-          <w:sz w:val="32"/>
+          <w:sz w:val="28"/>
           <w:b/>
         </w:rPr>
         <w:t>Data availability</w:t>
@@ -2573,7 +2574,7 @@
         <w:rPr>
           <w:rFonts w:ascii="Arial" w:hAnsi="Arial"/>
           <w:color w:val="000000"/>
-          <w:sz w:val="32"/>
+          <w:sz w:val="28"/>
           <w:b/>
         </w:rPr>
         <w:t>Supplementary Data</w:t>
@@ -2604,7 +2605,7 @@
         <w:rPr>
           <w:rFonts w:ascii="Arial" w:hAnsi="Arial"/>
           <w:color w:val="000000"/>
-          <w:sz w:val="32"/>
+          <w:sz w:val="28"/>
           <w:b/>
         </w:rPr>
         <w:t>Acknowledgements</w:t>
@@ -2635,7 +2636,7 @@
         <w:rPr>
           <w:rFonts w:ascii="Arial" w:hAnsi="Arial"/>
           <w:color w:val="000000"/>
-          <w:sz w:val="32"/>
+          <w:sz w:val="28"/>
           <w:b/>
         </w:rPr>
         <w:t>Author contributions</w:t>
@@ -2666,7 +2667,7 @@
         <w:rPr>
           <w:rFonts w:ascii="Arial" w:hAnsi="Arial"/>
           <w:color w:val="000000"/>
-          <w:sz w:val="32"/>
+          <w:sz w:val="28"/>
           <w:b/>
         </w:rPr>
         <w:t>Funding</w:t>
@@ -2697,7 +2698,7 @@
         <w:rPr>
           <w:rFonts w:ascii="Arial" w:hAnsi="Arial"/>
           <w:color w:val="000000"/>
-          <w:sz w:val="32"/>
+          <w:sz w:val="28"/>
           <w:b/>
         </w:rPr>
         <w:t>Conflict of interest</w:t>
@@ -2728,7 +2729,7 @@
         <w:rPr>
           <w:rFonts w:ascii="Arial" w:hAnsi="Arial"/>
           <w:color w:val="000000"/>
-          <w:sz w:val="32"/>
+          <w:sz w:val="28"/>
           <w:b/>
         </w:rPr>
         <w:t>Figure legends</w:t>
@@ -2839,7 +2840,7 @@
         <w:rPr>
           <w:rFonts w:ascii="Arial" w:hAnsi="Arial"/>
           <w:color w:val="000000"/>
-          <w:sz w:val="32"/>
+          <w:sz w:val="28"/>
           <w:b/>
         </w:rPr>
         <w:t>Supplementary Figure legends</w:t>
@@ -3062,7 +3063,7 @@
         <w:rPr>
           <w:rFonts w:ascii="Arial" w:hAnsi="Arial"/>
           <w:color w:val="000000"/>
-          <w:sz w:val="32"/>
+          <w:sz w:val="28"/>
           <w:b/>
         </w:rPr>
         <w:t>References</w:t>
@@ -3076,7 +3077,7 @@
         <w:rPr>
           <w:rFonts w:ascii="Arial" w:hAnsi="Arial"/>
           <w:color w:val="000000"/>
-          <w:sz w:val="44"/>
+          <w:sz w:val="20"/>
         </w:rPr>
         <w:t>Regev,A., Teichmann,S.A., Lander,E.S., Amit,I., Benoist,C., Birney,E., Bodenmiller,B., Campbell,P., Carninci,P., Clatworthy,M. et al. (2017) The Human Cell Atlas. *eLife*, **6**, e27041.</w:t>
       </w:r>
@@ -3089,7 +3090,7 @@
         <w:rPr>
           <w:rFonts w:ascii="Arial" w:hAnsi="Arial"/>
           <w:color w:val="000000"/>
-          <w:sz w:val="44"/>
+          <w:sz w:val="20"/>
         </w:rPr>
         <w:t>Korsunsky,I., Millard,N., Fan,J., Slowikowski,K., Zhang,F., Wei,K., Baglaenko,Y., Brenner,M., Loh,P.R. and Raychaudhuri,S. (2019) Fast, sensitive and accurate integration of single-cell data with Harmony. *Nat. Methods*, **16**, 1289–1296.</w:t>
       </w:r>
@@ -3102,7 +3103,7 @@
         <w:rPr>
           <w:rFonts w:ascii="Arial" w:hAnsi="Arial"/>
           <w:color w:val="000000"/>
-          <w:sz w:val="44"/>
+          <w:sz w:val="20"/>
         </w:rPr>
         <w:t>Lopez,R., Regier,J., Cole,M.B., Jordan,M.I. and Yosef,N. (2018) Deep generative modeling for single-cell transcriptomics. *Nat. Methods*, **15**, 1053–1058.</w:t>
       </w:r>
@@ -3115,7 +3116,7 @@
         <w:rPr>
           <w:rFonts w:ascii="Arial" w:hAnsi="Arial"/>
           <w:color w:val="000000"/>
-          <w:sz w:val="44"/>
+          <w:sz w:val="20"/>
         </w:rPr>
         <w:t>Rosen,Y., Brbic,M., Roohani,Y., Swanson,K., Li,Z. and Leskovec,J. (2024) Toward universal cell embeddings: integrating single-cell RNA-seq datasets across species with SATURN. *Nat. Methods*, **21**, 1492–1500.</w:t>
       </w:r>
@@ -3128,7 +3129,7 @@
         <w:rPr>
           <w:rFonts w:ascii="Arial" w:hAnsi="Arial"/>
           <w:color w:val="000000"/>
-          <w:sz w:val="44"/>
+          <w:sz w:val="20"/>
         </w:rPr>
         <w:t>Tran,H.T.N., Ang,K.S., Chevrier,M., Zhang,X., Lee,N.Y.S., Goh,M. and Chen,J. (2020) A benchmark of batch-effect correction methods for single-cell RNA sequencing data. *Genome Biol.*, **21**, 12.</w:t>
       </w:r>
@@ -3141,7 +3142,7 @@
         <w:rPr>
           <w:rFonts w:ascii="Arial" w:hAnsi="Arial"/>
           <w:color w:val="000000"/>
-          <w:sz w:val="44"/>
+          <w:sz w:val="20"/>
         </w:rPr>
         <w:t>Nei,M. and Gojobori,T. (1986) Simple methods for estimating the numbers of synonymous and nonsynonymous nucleotide substitutions. *Mol. Biol. Evol.*, **3**, 418–426.</w:t>
       </w:r>
@@ -3154,7 +3155,7 @@
         <w:rPr>
           <w:rFonts w:ascii="Arial" w:hAnsi="Arial"/>
           <w:color w:val="000000"/>
-          <w:sz w:val="44"/>
+          <w:sz w:val="20"/>
         </w:rPr>
         <w:t>Tabula Muris Consortium (2018) Single-cell transcriptomics of 20 mouse organs creates a Tabula Muris. *Nature*, **562**, 367–372.</w:t>
       </w:r>
@@ -3167,7 +3168,7 @@
         <w:rPr>
           <w:rFonts w:ascii="Arial" w:hAnsi="Arial"/>
           <w:color w:val="000000"/>
-          <w:sz w:val="44"/>
+          <w:sz w:val="20"/>
         </w:rPr>
         <w:t>Tabula Sapiens Consortium (2022) The Tabula Sapiens: a multiple-organ, single-cell transcriptomic atlas of humans. *Science*, **376**, eabl4896.</w:t>
       </w:r>
@@ -3180,7 +3181,7 @@
         <w:rPr>
           <w:rFonts w:ascii="Arial" w:hAnsi="Arial"/>
           <w:color w:val="000000"/>
-          <w:sz w:val="44"/>
+          <w:sz w:val="20"/>
         </w:rPr>
         <w:t>Cancer Genome Atlas Research Network (2014) Comprehensive molecular profiling of lung adenocarcinoma. *Nature*, **511**, 543–550.</w:t>
       </w:r>
@@ -3193,7 +3194,7 @@
         <w:rPr>
           <w:rFonts w:ascii="Arial" w:hAnsi="Arial"/>
           <w:color w:val="000000"/>
-          <w:sz w:val="44"/>
+          <w:sz w:val="20"/>
         </w:rPr>
         <w:t>Cancer Genome Atlas Network (2012) Comprehensive molecular portraits of human breast tumours. *Nature*, **490**, 61–70.</w:t>
       </w:r>
@@ -3206,7 +3207,7 @@
         <w:rPr>
           <w:rFonts w:ascii="Arial" w:hAnsi="Arial"/>
           <w:color w:val="000000"/>
-          <w:sz w:val="44"/>
+          <w:sz w:val="20"/>
         </w:rPr>
         <w:t>Siletti,K., Hodge,R., Mossi Albiach,A., Lee,K.W., Ding,S.L., Hu,L., Lönnerberg,P., Bakken,T., Casper,T., Clark,M. et al. (2023) Transcriptomic diversity of cell types across the adult human brain. *Science*, **382**, eadl7046.</w:t>
       </w:r>
@@ -3219,7 +3220,7 @@
         <w:rPr>
           <w:rFonts w:ascii="Arial" w:hAnsi="Arial"/>
           <w:color w:val="000000"/>
-          <w:sz w:val="44"/>
+          <w:sz w:val="20"/>
         </w:rPr>
         <w:t>Luecken,M.D. and Theis,F.J. (2019) Current best practices in single-cell RNA-seq analysis: a tutorial. *Mol. Syst. Biol.*, **15**, e8746.</w:t>
       </w:r>
@@ -3232,7 +3233,7 @@
         <w:rPr>
           <w:rFonts w:ascii="Arial" w:hAnsi="Arial"/>
           <w:color w:val="000000"/>
-          <w:sz w:val="44"/>
+          <w:sz w:val="20"/>
         </w:rPr>
         <w:t>Hounkpel,B., Chen,J., Gosline,S.J.C., Domeniconi,C. and Jiang,D. (2021) HRT Atlas v1.0 database: redefining human and mouse housekeeping genes and candidate reference transcripts by mining massive RNA-seq datasets. *Nucleic Acids Res.*, **49**, D947–D955.</w:t>
       </w:r>
@@ -3245,7 +3246,7 @@
         <w:rPr>
           <w:rFonts w:ascii="Arial" w:hAnsi="Arial"/>
           <w:color w:val="000000"/>
-          <w:sz w:val="44"/>
+          <w:sz w:val="20"/>
         </w:rPr>
         <w:t>Wolf,F.A., Angerer,P. and Theis,F.J. (2018) SCANPY: large-scale single-cell gene expression data analysis. *Genome Biol.*, **19**, 15.</w:t>
       </w:r>
@@ -3258,7 +3259,7 @@
         <w:rPr>
           <w:rFonts w:ascii="Arial" w:hAnsi="Arial"/>
           <w:color w:val="000000"/>
-          <w:sz w:val="44"/>
+          <w:sz w:val="20"/>
         </w:rPr>
         <w:t>Hao,Y., Hao,S., Andersen-Nissen,E., Mauck,W.M. 3rd, Zheng,S., Butler,A., Lee,M.J., Wilk,A.J., Darby,C., Zager,M. et al. (2021) Integrated analysis of multimodal single-cell data. *Cell*, **184**, 3573–3587.</w:t>
       </w:r>
@@ -3271,7 +3272,7 @@
         <w:rPr>
           <w:rFonts w:ascii="Arial" w:hAnsi="Arial"/>
           <w:color w:val="000000"/>
-          <w:sz w:val="44"/>
+          <w:sz w:val="20"/>
         </w:rPr>
         <w:t>Hao,Y., Stuart,T., Kowalski,M.H., Choudhary,S., Hoffman,P., Hartman,A., Srivastava,A., Molla,G., Madad,S., Fernandez-Granda,C. et al. (2024) Dictionary learning for integrative, multimodal and scalable single-cell analysis. *Nat. Biotechnol.*, **42**, 293–304.</w:t>
       </w:r>
@@ -3284,7 +3285,7 @@
         <w:rPr>
           <w:rFonts w:ascii="Arial" w:hAnsi="Arial"/>
           <w:color w:val="000000"/>
-          <w:sz w:val="44"/>
+          <w:sz w:val="20"/>
         </w:rPr>
         <w:t>Weinstein,J.N., Collisson,E.A., Mills,G.B., Shaw,K.R., Ozenberger,B.A., Ellrott,K., Shmulevich,I., Sander,C. and Stuart,J.M. (2013) The Cancer Genome Atlas Pan-Cancer analysis project. *Nat. Genet.*, **45**, 1113–1120.</w:t>
       </w:r>
@@ -3297,7 +3298,7 @@
         <w:rPr>
           <w:rFonts w:ascii="Arial" w:hAnsi="Arial"/>
           <w:color w:val="000000"/>
-          <w:sz w:val="44"/>
+          <w:sz w:val="20"/>
         </w:rPr>
         <w:t>Colaprico,A., Silva,T.C., Olsen,C., Garofano,L., Cava,C., Garolini,D., Sabedot,T.S., Malta,T.M., Pagnotta,S.M., Castiglioni,I. et al. (2016) TCGAbiolinks: an R/Bioconductor package for integrative analysis of TCGA data. *Nucleic Acids Res.*, **44**, e71.</w:t>
       </w:r>
@@ -3310,7 +3311,7 @@
         <w:rPr>
           <w:rFonts w:ascii="Arial" w:hAnsi="Arial"/>
           <w:color w:val="000000"/>
-          <w:sz w:val="44"/>
+          <w:sz w:val="20"/>
         </w:rPr>
         <w:t>Cerami,E., Gao,J., Dogrusoz,U., Gross,B.E., Sumer,S.O., Aksoy,B.A., Jacobsen,A., Byrne,C.J., Heuer,M.L., Larsson,E. et al. (2012) The cBio cancer genomics portal: an open platform for exploring multidimensional cancer genomics data. *Cancer Discov.*, **2**, 401–404.</w:t>
       </w:r>
@@ -3323,7 +3324,7 @@
         <w:rPr>
           <w:rFonts w:ascii="Arial" w:hAnsi="Arial"/>
           <w:color w:val="000000"/>
-          <w:sz w:val="44"/>
+          <w:sz w:val="20"/>
         </w:rPr>
         <w:t>Perou,C.M., Sørlie,T., Eisen,M.B., van de Rijn,M., Jeffrey,S.S., Rees,C.A., Pollack,J.R., Ross,D.T., Johnsen,H., Akslen,L.A. et al. (2000) Molecular portraits of human breast tumours. *Nature*, **406**, 747–752.</w:t>
       </w:r>
@@ -3336,7 +3337,7 @@
         <w:rPr>
           <w:rFonts w:ascii="Arial" w:hAnsi="Arial"/>
           <w:color w:val="000000"/>
-          <w:sz w:val="44"/>
+          <w:sz w:val="20"/>
         </w:rPr>
         <w:t>Parker,J.S., Mullins,M., Cheang,M.C.U., Leung,S., Voduc,D., Vickery,T., Davies,S., Fauron,C., He,X., Hu,Z. et al. (2009) Supervised risk predictor of breast cancer based on intrinsic subtypes. *J. Clin. Oncol.*, **27**, 1160–1167.</w:t>
       </w:r>
@@ -3349,7 +3350,7 @@
         <w:rPr>
           <w:rFonts w:ascii="Arial" w:hAnsi="Arial"/>
           <w:color w:val="000000"/>
-          <w:sz w:val="44"/>
+          <w:sz w:val="20"/>
         </w:rPr>
         <w:t>Edmondson,H.A. and Steiner,P.E. (1954) Primary carcinoma of the liver: a study of 100 cases among 48,900 necropsies. *Cancer*, **7**, 462–503.</w:t>
       </w:r>
@@ -3362,7 +3363,7 @@
         <w:rPr>
           <w:rFonts w:ascii="Arial" w:hAnsi="Arial"/>
           <w:color w:val="000000"/>
-          <w:sz w:val="44"/>
+          <w:sz w:val="20"/>
         </w:rPr>
         <w:t>Storey,J.D. and Tibshirani,R. (2003) Statistical significance for genomewide studies. *Proc. Natl. Acad. Sci. USA*, **100**, 9440–9445.</w:t>
       </w:r>
@@ -3375,7 +3376,7 @@
         <w:rPr>
           <w:rFonts w:ascii="Arial" w:hAnsi="Arial"/>
           <w:color w:val="000000"/>
-          <w:sz w:val="44"/>
+          <w:sz w:val="20"/>
         </w:rPr>
         <w:t>Wälchli,T., Ghobrial,M., Schwab,M.E., Takada,S., Zhong,H., Suntharalingham,S., Vetiska,S., Gonzalez,D.R., Wu,R., Rehrauer,H. et al. (2024) Single-cell atlas of the human brain vasculature across development, adulthood and disease. *Nature*, **632**, 603–613.</w:t>
       </w:r>
@@ -3388,7 +3389,7 @@
         <w:rPr>
           <w:rFonts w:ascii="Arial" w:hAnsi="Arial"/>
           <w:color w:val="000000"/>
-          <w:sz w:val="44"/>
+          <w:sz w:val="20"/>
         </w:rPr>
         <w:t>Tsai,H.H., Niu,J., Munji,R., Davalos,D., Chang,J., Zhang,H., Tien,A.C., Kuo,C.J., Chan,J.R., Daneman,R. et al. (2016) Oligodendrocyte precursors migrate along vasculature in the developing nervous system. *Science*, **351**, 379–384.</w:t>
       </w:r>
@@ -3401,7 +3402,7 @@
         <w:rPr>
           <w:rFonts w:ascii="Arial" w:hAnsi="Arial"/>
           <w:color w:val="000000"/>
-          <w:sz w:val="44"/>
+          <w:sz w:val="20"/>
         </w:rPr>
         <w:t>Akay,L.A., Effenberger,A.H. and Tsai,L.H. (2022) Astrocyte endfoot formation controls the termination of oligodendrocyte precursor cell perivascular migration. *Neuron*, **111**, 190–201.e8.</w:t>
       </w:r>
@@ -3414,7 +3415,7 @@
         <w:rPr>
           <w:rFonts w:ascii="Arial" w:hAnsi="Arial"/>
           <w:color w:val="000000"/>
-          <w:sz w:val="44"/>
+          <w:sz w:val="20"/>
         </w:rPr>
         <w:t>Foerster,S., Floriddia,E.M., Neumann,B., Agirre,E., Castelo-Branco,G. and Franklin,R.J.M. (2024) Developmental origin of oligodendrocytes determines their function in the adult brain. *Nat. Neurosci.*, **27**, 1155–1165.</w:t>
       </w:r>
@@ -3427,7 +3428,7 @@
         <w:rPr>
           <w:rFonts w:ascii="Arial" w:hAnsi="Arial"/>
           <w:color w:val="000000"/>
-          <w:sz w:val="44"/>
+          <w:sz w:val="20"/>
         </w:rPr>
         <w:t>Reeber,S.L., Arancillo,M. and Sillitoe,R.V. (2015) Bergmann glia are patterned into topographic molecular zones in the cerebellum. *Cerebellum*, **14**, 392–403.</w:t>
       </w:r>
@@ -3440,7 +3441,7 @@
         <w:rPr>
           <w:rFonts w:ascii="Arial" w:hAnsi="Arial"/>
           <w:color w:val="000000"/>
-          <w:sz w:val="44"/>
+          <w:sz w:val="20"/>
         </w:rPr>
         <w:t>Endo,F., Kasai,A., Cui,W., Tanaka,K.F. and Hashimoto,H. (2024) Astrocyte allocation during brain development is controlled by Tcf4-mediated fate restriction. *EMBO J.*, **43**, 4423–4447.</w:t>
       </w:r>
@@ -3453,7 +3454,7 @@
         <w:rPr>
           <w:rFonts w:ascii="Arial" w:hAnsi="Arial"/>
           <w:color w:val="000000"/>
-          <w:sz w:val="44"/>
+          <w:sz w:val="20"/>
         </w:rPr>
         <w:t>Yang,L., Zhao,Z., Li,Y., Wang,J., Chen,X. and Liu,Z. (2024) Single-cell multi-omics analysis of lineage development and spatial organization in the human fetal cerebellum. *Cell Discov.*, **10**, 25.</w:t>
       </w:r>
@@ -3466,7 +3467,7 @@
         <w:rPr>
           <w:rFonts w:ascii="Arial" w:hAnsi="Arial"/>
           <w:color w:val="000000"/>
-          <w:sz w:val="44"/>
+          <w:sz w:val="20"/>
         </w:rPr>
         <w:t>Shemer,A. and Jung,S. (2024) The molecular determinants of microglial developmental colonization. *Nat. Rev. Neurosci.*, **25**, 414–427.</w:t>
       </w:r>
@@ -3479,7 +3480,7 @@
         <w:rPr>
           <w:rFonts w:ascii="Arial" w:hAnsi="Arial"/>
           <w:color w:val="000000"/>
-          <w:sz w:val="44"/>
+          <w:sz w:val="20"/>
         </w:rPr>
         <w:t>Menassa,D.A., Muntslag,T.A.O., Martin-Estebané,M., Barry-Carroll,L., Chapman,M.A., Adorjan,I., Tyler,T., Turnbull,B., Rose-Zerilli,M.J.J., Nicoll,J.A.R. et al. (2022) The spatiotemporal dynamics of microglia across the human lifespan. *Dev. Cell*, **57**, 2127–2139.e6.</w:t>
       </w:r>
@@ -3492,7 +3493,7 @@
         <w:rPr>
           <w:rFonts w:ascii="Arial" w:hAnsi="Arial"/>
           <w:color w:val="000000"/>
-          <w:sz w:val="44"/>
+          <w:sz w:val="20"/>
         </w:rPr>
         <w:t>Barry-Carroll,L., Greulich,P., Marshall,A.R., Riecken,K., Fehse,B., Askew,K.E., Li,K., Garaschuk,O., Menassa,D.A. and Gomez-Nicola,D. (2023) Microglia colonize the developing brain by clonal expansion of highly proliferative progenitors. *Cell Rep.*, **42**, 112425.</w:t>
       </w:r>
@@ -3505,7 +3506,7 @@
         <w:rPr>
           <w:rFonts w:ascii="Arial" w:hAnsi="Arial"/>
           <w:color w:val="000000"/>
-          <w:sz w:val="44"/>
+          <w:sz w:val="20"/>
         </w:rPr>
         <w:t>Schaffenrath,J., Huang,S.F., Wyss,T., Delorenzi,M. and Keller,A. (2024) Characteristics of blood-brain barrier heterogeneity between brain regions. *Nat. Neurosci.*, **27**, 1851–1865.</w:t>
       </w:r>
@@ -3518,7 +3519,7 @@
         <w:rPr>
           <w:rFonts w:ascii="Arial" w:hAnsi="Arial"/>
           <w:color w:val="000000"/>
-          <w:sz w:val="44"/>
+          <w:sz w:val="20"/>
         </w:rPr>
         <w:t>Jones,H.E., Coelho-Santos,V., Bonney,S.K., Abrams,S.R., Shih,A.Y. and Siegenthaler,J.A. (2023) Meningeal origins and dynamics of perivascular fibroblast development. *Development*, **150**, dev201805.</w:t>
       </w:r>
@@ -3531,7 +3532,7 @@
         <w:rPr>
           <w:rFonts w:ascii="Arial" w:hAnsi="Arial"/>
           <w:color w:val="000000"/>
-          <w:sz w:val="44"/>
+          <w:sz w:val="20"/>
         </w:rPr>
         <w:t>Tarashansky,A.J., Musser,J.M., Khariton,M., Li,P., Arendt,D., Quake,S.R. and Wang,B. (2021) Mapping single-cell atlases throughout Metazoa unravels cell type evolution. *eLife*, **10**, e66747.</w:t>
       </w:r>
@@ -3544,7 +3545,7 @@
         <w:rPr>
           <w:rFonts w:ascii="Arial" w:hAnsi="Arial"/>
           <w:color w:val="000000"/>
-          <w:sz w:val="44"/>
+          <w:sz w:val="20"/>
         </w:rPr>
         <w:t>Jiang,J., Li,J., Huang,Y., Wang,Y., Chen,L. and Zhang,X. (2024) CACIMAR: cross-species analysis of cell identities, markers, regulations, and interactions. *Brief. Bioinform.*, **25**, bbae283.</w:t>
       </w:r>
@@ -3557,7 +3558,7 @@
         <w:rPr>
           <w:rFonts w:ascii="Arial" w:hAnsi="Arial"/>
           <w:color w:val="000000"/>
-          <w:sz w:val="44"/>
+          <w:sz w:val="20"/>
         </w:rPr>
         <w:t>CZI Cell Science Program (2025) CZ CELLxGENE Discover: a single-cell data platform for scalable exploration, analysis and modeling of aggregated data. *Nucleic Acids Res.*, **53**, D886–D900.</w:t>
       </w:r>
@@ -3570,7 +3571,7 @@
         <w:rPr>
           <w:rFonts w:ascii="Arial" w:hAnsi="Arial"/>
           <w:color w:val="000000"/>
-          <w:sz w:val="44"/>
+          <w:sz w:val="20"/>
         </w:rPr>
         <w:t>Liberzon,A., Birger,C., Thorvaldsdóttir,H., Ghandi,M., Mesirov,J.P. and Tamayo,P. (2015) The Molecular Signatures Database Hallmark Gene Set Collection. *Cell Syst.*, **1**, 417–425.</w:t>
       </w:r>
@@ -3583,7 +3584,7 @@
         <w:rPr>
           <w:rFonts w:ascii="Arial" w:hAnsi="Arial"/>
           <w:color w:val="000000"/>
-          <w:sz w:val="44"/>
+          <w:sz w:val="20"/>
         </w:rPr>
         <w:t>Yang,Z. (2007) PAML 4: phylogenetic analysis by maximum likelihood. *Mol. Biol. Evol.*, **24**, 1586–1591.</w:t>
       </w:r>
@@ -3596,7 +3597,7 @@
         <w:rPr>
           <w:rFonts w:ascii="Arial" w:hAnsi="Arial"/>
           <w:color w:val="000000"/>
-          <w:sz w:val="44"/>
+          <w:sz w:val="20"/>
         </w:rPr>
         <w:t>Tan,Y.L., Yuan,Y. and Tian,L. (2020) Microglial regional heterogeneity and its role in the brain. *Mol. Psychiatry*, **25**, 351–367.</w:t>
       </w:r>
@@ -3609,7 +3610,7 @@
         <w:rPr>
           <w:rFonts w:ascii="Arial" w:hAnsi="Arial"/>
           <w:color w:val="000000"/>
-          <w:sz w:val="44"/>
+          <w:sz w:val="20"/>
         </w:rPr>
         <w:t>Lin,J. (1991) Divergence measures based on the Shannon entropy. *IEEE Trans. Inf. Theory*, **37**, 145–151.</w:t>
       </w:r>
@@ -3622,7 +3623,7 @@
         <w:rPr>
           <w:rFonts w:ascii="Arial" w:hAnsi="Arial"/>
           <w:color w:val="000000"/>
-          <w:sz w:val="44"/>
+          <w:sz w:val="20"/>
         </w:rPr>
         <w:t>Efron,B. and Tibshirani,R.J. (1994) An Introduction to the Bootstrap. Chapman and Hall/CRC, New York.</w:t>
       </w:r>
@@ -3635,7 +3636,7 @@
         <w:rPr>
           <w:rFonts w:ascii="Arial" w:hAnsi="Arial"/>
           <w:color w:val="000000"/>
-          <w:sz w:val="44"/>
+          <w:sz w:val="20"/>
         </w:rPr>
         <w:t>Bakken,T.E., Jorstad,N.L., Hu,Q., Lake,B.B., Tian,W., Kalmbach,B.E., Crow,M., Hodge,R.D., Krienen,F.M., Sorensen,S.A. et al. (2021) Comparative cellular analysis of motor cortex in human, marmoset and mouse. *Nature*, **598**, 111–119.</w:t>
       </w:r>
@@ -3648,7 +3649,7 @@
         <w:rPr>
           <w:rFonts w:ascii="Arial" w:hAnsi="Arial"/>
           <w:color w:val="000000"/>
-          <w:sz w:val="44"/>
+          <w:sz w:val="20"/>
         </w:rPr>
         <w:t>Pedregosa,F., Varoquaux,G., Gramfort,A., Michel,V., Thirion,B., Grisel,O., Blondel,M., Prettenhofer,P., Weiss,R., Dubourg,V. et al. (2011) Scikit-learn: machine learning in Python. *J. Mach. Learn. Res.*, **12**, 2825–2830.</w:t>
       </w:r>
@@ -3661,7 +3662,7 @@
         <w:rPr>
           <w:rFonts w:ascii="Arial" w:hAnsi="Arial"/>
           <w:color w:val="000000"/>
-          <w:sz w:val="44"/>
+          <w:sz w:val="20"/>
         </w:rPr>
         <w:t>Waskom,M.L. (2021) seaborn: statistical data visualization. *J. Open Source Softw.*, **6**, 3021.</w:t>
       </w:r>
@@ -3674,7 +3675,7 @@
         <w:rPr>
           <w:rFonts w:ascii="Arial" w:hAnsi="Arial"/>
           <w:color w:val="000000"/>
-          <w:sz w:val="44"/>
+          <w:sz w:val="20"/>
         </w:rPr>
         <w:t>Butte,A.J., Dzau,V.J. and Glueck,S.B. (2001) Further defining housekeeping, or maintenance, genes: focus on A compendium of gene expression in normal human tissues. *Physiol. Genomics*, **7**, 95-96.</w:t>
       </w:r>
@@ -4058,7 +4059,7 @@
     <w:rPr>
       <w:rFonts w:ascii="Arial" w:hAnsi="Arial"/>
       <w:color w:val="000000"/>
-      <w:sz w:val="40"/>
+      <w:sz w:val="22"/>
     </w:rPr>
   </w:style>
   <w:style w:type="paragraph" w:styleId="Header">

</xml_diff>